<commit_message>
many advances - WGSO option, plus bf16 version
</commit_message>
<xml_diff>
--- a/Gilad_Senderovich_CV_2026.docx
+++ b/Gilad_Senderovich_CV_2026.docx
@@ -108,6 +108,20 @@
         </w:tabs>
         <w:spacing w:after="40" w:before="160"/>
       </w:pPr>
+      <w:hyperlink r:id="rIdOdysight" w:history="1">
+        <w:r>
+          <w:rPr>
+            <w:rFonts w:ascii="Calibri" w:cs="Calibri" w:eastAsia="Calibri" w:hAnsi="Calibri"/>
+            <w:b/>
+            <w:bCs/>
+            <w:color w:val="1F4E79"/>
+            <w:sz w:val="22"/>
+            <w:szCs w:val="22"/>
+            <w:u w:val="single"/>
+          </w:rPr>
+          <w:t xml:space="preserve">Odysight.AI</w:t>
+        </w:r>
+      </w:hyperlink>
       <w:r>
         <w:rPr>
           <w:rFonts w:ascii="Calibri" w:cs="Calibri" w:eastAsia="Calibri" w:hAnsi="Calibri"/>
@@ -116,7 +130,7 @@
           <w:sz w:val="22"/>
           <w:szCs w:val="22"/>
         </w:rPr>
-        <w:t xml:space="preserve">Odysight.AI — Data Scientist &amp; Computer Vision Researcher</w:t>
+        <w:t xml:space="preserve"> — Data Scientist &amp; Computer Vision Researcher</w:t>
       </w:r>
       <w:r>
         <w:rPr>
@@ -179,15 +193,7 @@
           <w:sz w:val="20"/>
           <w:szCs w:val="20"/>
         </w:rPr>
-        <w:t xml:space="preserve">Implement and ship anomaly detection, motion tracking and segmentation models, </w:t>
-      </w:r>
-      <w:r>
-        <w:rPr>
-          <w:rFonts w:ascii="Calibri" w:cs="Calibri" w:eastAsia="Calibri" w:hAnsi="Calibri"/>
-          <w:sz w:val="20"/>
-          <w:szCs w:val="20"/>
-        </w:rPr>
-        <w:t xml:space="preserve">combining classical image processing with modern deep-learning architectures.</w:t>
+        <w:t>Implement and ship anomaly detection, motion tracking and segmentation models, combining classical image processing with modern deep-learning architectures.</w:t>
       </w:r>
     </w:p>
     <w:p>
@@ -223,15 +229,7 @@
           <w:sz w:val="20"/>
           <w:szCs w:val="20"/>
         </w:rPr>
-        <w:t xml:space="preserve">Cross-functional collaboration with hardware, systems and product teams to translate </w:t>
-      </w:r>
-      <w:r>
-        <w:rPr>
-          <w:rFonts w:ascii="Calibri" w:cs="Calibri" w:eastAsia="Calibri" w:hAnsi="Calibri"/>
-          <w:sz w:val="20"/>
-          <w:szCs w:val="20"/>
-        </w:rPr>
-        <w:t xml:space="preserve">physical sensor characteristics into model design choices.</w:t>
+        <w:t>Cross-functional collaboration with hardware, systems and product teams to translate physical sensor characteristics into model design choices.</w:t>
       </w:r>
     </w:p>
     <w:p>
@@ -241,6 +239,20 @@
         </w:tabs>
         <w:spacing w:after="40" w:before="160"/>
       </w:pPr>
+      <w:hyperlink r:id="rIdRafael" w:history="1">
+        <w:r>
+          <w:rPr>
+            <w:rFonts w:ascii="Calibri" w:cs="Calibri" w:eastAsia="Calibri" w:hAnsi="Calibri"/>
+            <w:b/>
+            <w:bCs/>
+            <w:color w:val="1F4E79"/>
+            <w:sz w:val="22"/>
+            <w:szCs w:val="22"/>
+            <w:u w:val="single"/>
+          </w:rPr>
+          <w:t xml:space="preserve">Rafael Defence Systems</w:t>
+        </w:r>
+      </w:hyperlink>
       <w:r>
         <w:rPr>
           <w:rFonts w:ascii="Calibri" w:cs="Calibri" w:eastAsia="Calibri" w:hAnsi="Calibri"/>
@@ -249,7 +261,7 @@
           <w:sz w:val="22"/>
           <w:szCs w:val="22"/>
         </w:rPr>
-        <w:t xml:space="preserve">VisionMap — Data Scientist</w:t>
+        <w:t xml:space="preserve"> — Data Scientist</w:t>
       </w:r>
       <w:r>
         <w:rPr>
@@ -294,41 +306,25 @@
           <w:sz w:val="20"/>
           <w:szCs w:val="20"/>
         </w:rPr>
-        <w:t xml:space="preserve">Built ML models for time-series analysis, geographic data and graph link-prediction problems </w:t>
-      </w:r>
-      <w:r>
-        <w:rPr>
-          <w:rFonts w:ascii="Calibri" w:cs="Calibri" w:eastAsia="Calibri" w:hAnsi="Calibri"/>
-          <w:sz w:val="20"/>
-          <w:szCs w:val="20"/>
-        </w:rPr>
-        <w:t xml:space="preserve">on very large, heterogeneous datasets.</w:t>
-      </w:r>
-    </w:p>
-    <w:p>
-      <w:pPr>
-        <w:pStyle w:val="ListParagraph"/>
-        <w:numPr>
-          <w:ilvl w:val="0"/>
-          <w:numId w:val="2"/>
-        </w:numPr>
-        <w:spacing w:after="60"/>
-      </w:pPr>
-      <w:r>
-        <w:rPr>
-          <w:rFonts w:ascii="Calibri" w:cs="Calibri" w:eastAsia="Calibri" w:hAnsi="Calibri"/>
-          <w:sz w:val="20"/>
-          <w:szCs w:val="20"/>
-        </w:rPr>
-        <w:t xml:space="preserve">Stack: Python, pandas, NumPy, SciPy, scikit-learn, XGBoost, PyTorch, TensorFlow, SQL </w:t>
-      </w:r>
-      <w:r>
-        <w:rPr>
-          <w:rFonts w:ascii="Calibri" w:cs="Calibri" w:eastAsia="Calibri" w:hAnsi="Calibri"/>
-          <w:sz w:val="20"/>
-          <w:szCs w:val="20"/>
-        </w:rPr>
-        <w:t xml:space="preserve">(Linux and Windows).</w:t>
+        <w:t>Built ML models for time-series analysis, geographic data and graph link-prediction problems on very large, heterogeneous datasets.</w:t>
+      </w:r>
+    </w:p>
+    <w:p>
+      <w:pPr>
+        <w:pStyle w:val="ListParagraph"/>
+        <w:numPr>
+          <w:ilvl w:val="0"/>
+          <w:numId w:val="2"/>
+        </w:numPr>
+        <w:spacing w:after="60"/>
+      </w:pPr>
+      <w:r>
+        <w:rPr>
+          <w:rFonts w:ascii="Calibri" w:cs="Calibri" w:eastAsia="Calibri" w:hAnsi="Calibri"/>
+          <w:sz w:val="20"/>
+          <w:szCs w:val="20"/>
+        </w:rPr>
+        <w:t>Stack: Python, pandas, NumPy, SciPy, scikit-learn, XGBoost, PyTorch, TensorFlow, SQL (Linux and Windows).</w:t>
       </w:r>
     </w:p>
     <w:p>
@@ -356,6 +352,20 @@
         </w:tabs>
         <w:spacing w:after="40" w:before="160"/>
       </w:pPr>
+      <w:hyperlink r:id="rIdInsightec" w:history="1">
+        <w:r>
+          <w:rPr>
+            <w:rFonts w:ascii="Calibri" w:cs="Calibri" w:eastAsia="Calibri" w:hAnsi="Calibri"/>
+            <w:b/>
+            <w:bCs/>
+            <w:color w:val="1F4E79"/>
+            <w:sz w:val="22"/>
+            <w:szCs w:val="22"/>
+            <w:u w:val="single"/>
+          </w:rPr>
+          <w:t xml:space="preserve">INSIGHTEC</w:t>
+        </w:r>
+      </w:hyperlink>
       <w:r>
         <w:rPr>
           <w:rFonts w:ascii="Calibri" w:cs="Calibri" w:eastAsia="Calibri" w:hAnsi="Calibri"/>
@@ -364,7 +374,7 @@
           <w:sz w:val="22"/>
           <w:szCs w:val="22"/>
         </w:rPr>
-        <w:t xml:space="preserve">INSIGHTEC — World leader in MRI-guided focused-ultrasound non-invasive surgery</w:t>
+        <w:t xml:space="preserve"> — World leader in MRI-guided focused-ultrasound non-invasive surgery</w:t>
       </w:r>
       <w:r>
         <w:rPr>
@@ -497,15 +507,7 @@
           <w:sz w:val="20"/>
           <w:szCs w:val="20"/>
         </w:rPr>
-        <w:t xml:space="preserve">Led the team in charge of procedures and tools that configure MRI machines and INSIGHTEC’s </w:t>
-      </w:r>
-      <w:r>
-        <w:rPr>
-          <w:rFonts w:ascii="Calibri" w:cs="Calibri" w:eastAsia="Calibri" w:hAnsi="Calibri"/>
-          <w:sz w:val="20"/>
-          <w:szCs w:val="20"/>
-        </w:rPr>
-        <w:t xml:space="preserve">focused-ultrasound system to operate together.</w:t>
+        <w:t>Led the team in charge of procedures and tools that configure MRI machines and INSIGHTEC’s focused-ultrasound system to operate together.</w:t>
       </w:r>
     </w:p>
     <w:p>
@@ -593,15 +595,7 @@
           <w:sz w:val="20"/>
           <w:szCs w:val="20"/>
         </w:rPr>
-        <w:t xml:space="preserve">Researched MRI imaging of ultrasound beams — contributing to a novel method for </w:t>
-      </w:r>
-      <w:r>
-        <w:rPr>
-          <w:rFonts w:ascii="Calibri" w:cs="Calibri" w:eastAsia="Calibri" w:hAnsi="Calibri"/>
-          <w:sz w:val="20"/>
-          <w:szCs w:val="20"/>
-        </w:rPr>
-        <w:t xml:space="preserve">focusing through the human skull. Image processing and algorithm development in MATLAB.</w:t>
+        <w:t>Researched MRI imaging of ultrasound beams — contributing to a novel method for focusing through the human skull. Image processing and algorithm development in MATLAB.</w:t>
       </w:r>
     </w:p>
     <w:p>
@@ -702,7 +696,7 @@
           <w:sz w:val="26"/>
           <w:szCs w:val="26"/>
         </w:rPr>
-        <w:t xml:space="preserve">Selected Independent Research Project</w:t>
+        <w:t xml:space="preserve">Selected Independent Research Projects</w:t>
       </w:r>
     </w:p>
     <w:p>
@@ -720,7 +714,7 @@
           <w:sz w:val="22"/>
           <w:szCs w:val="22"/>
         </w:rPr>
-        <w:t xml:space="preserve">OlsVered: Numerically Stable K-FAC and OLS Algorithms</w:t>
+        <w:t xml:space="preserve">InvFreeOls: Numerically Stable K-FAC and OLS Algorithms</w:t>
       </w:r>
       <w:r>
         <w:rPr>
@@ -765,219 +759,370 @@
           <w:sz w:val="20"/>
           <w:szCs w:val="20"/>
         </w:rPr>
-        <w:t xml:space="preserve">Designed and implemented three K-FAC second-order optimiser variants </w:t>
-      </w:r>
-      <w:r>
-        <w:rPr>
-          <w:rFonts w:ascii="Calibri" w:cs="Calibri" w:eastAsia="Calibri" w:hAnsi="Calibri"/>
-          <w:sz w:val="20"/>
-          <w:szCs w:val="20"/>
-        </w:rPr>
-        <w:t xml:space="preserve">(Classic, Cholesky-based OlsSM, QR-based Vered) sharing a common framework, </w:t>
-      </w:r>
-      <w:r>
-        <w:rPr>
-          <w:rFonts w:ascii="Calibri" w:cs="Calibri" w:eastAsia="Calibri" w:hAnsi="Calibri"/>
-          <w:sz w:val="20"/>
-          <w:szCs w:val="20"/>
-        </w:rPr>
-        <w:t xml:space="preserve">isolating the inversion strategy as the only differentiator.</w:t>
-      </w:r>
-    </w:p>
-    <w:p>
-      <w:pPr>
-        <w:pStyle w:val="ListParagraph"/>
-        <w:numPr>
-          <w:ilvl w:val="0"/>
-          <w:numId w:val="2"/>
-        </w:numPr>
-        <w:spacing w:after="60"/>
-      </w:pPr>
-      <w:r>
-        <w:rPr>
-          <w:rFonts w:ascii="Calibri" w:cs="Calibri" w:eastAsia="Calibri" w:hAnsi="Calibri"/>
-          <w:sz w:val="20"/>
-          <w:szCs w:val="20"/>
-        </w:rPr>
-        <w:t xml:space="preserve">Derived and empirically validated the per-variant numerical-error scaling: </w:t>
-      </w:r>
-      <w:r>
-        <w:rPr>
-          <w:rFonts w:ascii="Calibri" w:cs="Calibri" w:eastAsia="Calibri" w:hAnsi="Calibri"/>
-          <w:sz w:val="20"/>
-          <w:szCs w:val="20"/>
-        </w:rPr>
-        <w:t xml:space="preserve">κ(X)⁴·ε (Classic) vs κ(X)²·ε (OlsSM) vs κ(X)¹·ε (Vered).</w:t>
-      </w:r>
-    </w:p>
-    <w:p>
-      <w:pPr>
-        <w:pStyle w:val="ListParagraph"/>
-        <w:numPr>
-          <w:ilvl w:val="0"/>
-          <w:numId w:val="2"/>
-        </w:numPr>
-        <w:spacing w:after="60"/>
-      </w:pPr>
-      <w:r>
-        <w:rPr>
-          <w:rFonts w:ascii="Calibri" w:cs="Calibri" w:eastAsia="Calibri" w:hAnsi="Calibri"/>
-          <w:sz w:val="20"/>
-          <w:szCs w:val="20"/>
-        </w:rPr>
-        <w:t xml:space="preserve">Implemented the Rust core (LU and Cholesky paths, randomized EVD via </w:t>
-      </w:r>
-      <w:r>
-        <w:rPr>
-          <w:rFonts w:ascii="Calibri" w:cs="Calibri" w:eastAsia="Calibri" w:hAnsi="Calibri"/>
-          <w:sz w:val="20"/>
-          <w:szCs w:val="20"/>
-        </w:rPr>
-        <w:t xml:space="preserve">Halko–Martinsson–Tropp, streaming TSQR for QR-based variant) with PyO3 bindings </w:t>
-      </w:r>
-      <w:r>
-        <w:rPr>
-          <w:rFonts w:ascii="Calibri" w:cs="Calibri" w:eastAsia="Calibri" w:hAnsi="Calibri"/>
-          <w:sz w:val="20"/>
-          <w:szCs w:val="20"/>
-        </w:rPr>
-        <w:t xml:space="preserve">and a faer-accelerated SIMD path on CPU.</w:t>
-      </w:r>
-    </w:p>
-    <w:p>
-      <w:pPr>
-        <w:pStyle w:val="ListParagraph"/>
-        <w:numPr>
-          <w:ilvl w:val="0"/>
-          <w:numId w:val="2"/>
-        </w:numPr>
-        <w:spacing w:after="60"/>
-      </w:pPr>
-      <w:r>
-        <w:rPr>
-          <w:rFonts w:ascii="Calibri" w:cs="Calibri" w:eastAsia="Calibri" w:hAnsi="Calibri"/>
-          <w:sz w:val="20"/>
-          <w:szCs w:val="20"/>
-        </w:rPr>
-        <w:t xml:space="preserve">Built four end-to-end benchmark suites (GPU training, stability frontier, </w:t>
-      </w:r>
-      <w:r>
-        <w:rPr>
-          <w:rFonts w:ascii="Calibri" w:cs="Calibri" w:eastAsia="Calibri" w:hAnsi="Calibri"/>
-          <w:sz w:val="20"/>
-          <w:szCs w:val="20"/>
-        </w:rPr>
-        <w:t xml:space="preserve">gradient-clip frontier, layer-retrainer with Block Coordinate Descent / LoRA) </w:t>
-      </w:r>
-      <w:r>
-        <w:rPr>
-          <w:rFonts w:ascii="Calibri" w:cs="Calibri" w:eastAsia="Calibri" w:hAnsi="Calibri"/>
-          <w:sz w:val="20"/>
-          <w:szCs w:val="20"/>
-        </w:rPr>
-        <w:t xml:space="preserve">with incremental crash-resistant saving, condition-number tracking and </w:t>
-      </w:r>
-      <w:r>
-        <w:rPr>
-          <w:rFonts w:ascii="Calibri" w:cs="Calibri" w:eastAsia="Calibri" w:hAnsi="Calibri"/>
-          <w:sz w:val="20"/>
-          <w:szCs w:val="20"/>
-        </w:rPr>
-        <w:t xml:space="preserve">automatic divergence detection.</w:t>
-      </w:r>
-    </w:p>
-    <w:p>
-      <w:pPr>
-        <w:pStyle w:val="ListParagraph"/>
-        <w:numPr>
-          <w:ilvl w:val="0"/>
-          <w:numId w:val="2"/>
-        </w:numPr>
-        <w:spacing w:after="60"/>
-      </w:pPr>
-      <w:r>
-        <w:rPr>
-          <w:rFonts w:ascii="Calibri" w:cs="Calibri" w:eastAsia="Calibri" w:hAnsi="Calibri"/>
-          <w:sz w:val="20"/>
-          <w:szCs w:val="20"/>
-        </w:rPr>
-        <w:t xml:space="preserve">Drove a 19% perplexity improvement on SmallGPT pre-training (WikiText-2) by </w:t>
-      </w:r>
-      <w:r>
-        <w:rPr>
-          <w:rFonts w:ascii="Calibri" w:cs="Calibri" w:eastAsia="Calibri" w:hAnsi="Calibri"/>
-          <w:sz w:val="20"/>
-          <w:szCs w:val="20"/>
-        </w:rPr>
-        <w:t xml:space="preserve">using the QR-based variant with 100× lower damping, validating the predicted </w:t>
-      </w:r>
-      <w:r>
-        <w:rPr>
-          <w:rFonts w:ascii="Calibri" w:cs="Calibri" w:eastAsia="Calibri" w:hAnsi="Calibri"/>
-          <w:sz w:val="20"/>
-          <w:szCs w:val="20"/>
-        </w:rPr>
-        <w:t xml:space="preserve">κ-scaling advantage on a real workload.</w:t>
-      </w:r>
-    </w:p>
-    <w:p>
-      <w:pPr>
-        <w:pStyle w:val="ListParagraph"/>
-        <w:numPr>
-          <w:ilvl w:val="0"/>
-          <w:numId w:val="2"/>
-        </w:numPr>
-        <w:spacing w:after="60"/>
-      </w:pPr>
-      <w:r>
-        <w:rPr>
-          <w:rFonts w:ascii="Calibri" w:cs="Calibri" w:eastAsia="Calibri" w:hAnsi="Calibri"/>
-          <w:sz w:val="20"/>
-          <w:szCs w:val="20"/>
-        </w:rPr>
-        <w:t xml:space="preserve">Diagnosed and patched several non-trivial issues: streaming-TSQR p≥n violations, </w:t>
-      </w:r>
-      <w:r>
-        <w:rPr>
-          <w:rFonts w:ascii="Calibri" w:cs="Calibri" w:eastAsia="Calibri" w:hAnsi="Calibri"/>
-          <w:sz w:val="20"/>
-          <w:szCs w:val="20"/>
-        </w:rPr>
-        <w:t xml:space="preserve">Cholesky failures on non-PSD Gram matrices (with EVD-projection fallback), </w:t>
-      </w:r>
-      <w:r>
-        <w:rPr>
-          <w:rFonts w:ascii="Calibri" w:cs="Calibri" w:eastAsia="Calibri" w:hAnsi="Calibri"/>
-          <w:sz w:val="20"/>
-          <w:szCs w:val="20"/>
-        </w:rPr>
-        <w:t xml:space="preserve">BCD oscillation in coupled layer chains (with warm-start fix).</w:t>
-      </w:r>
-    </w:p>
-    <w:p>
-      <w:pPr>
-        <w:pStyle w:val="ListParagraph"/>
-        <w:numPr>
-          <w:ilvl w:val="0"/>
-          <w:numId w:val="2"/>
-        </w:numPr>
-        <w:spacing w:after="60"/>
-      </w:pPr>
-      <w:r>
-        <w:rPr>
-          <w:rFonts w:ascii="Calibri" w:cs="Calibri" w:eastAsia="Calibri" w:hAnsi="Calibri"/>
-          <w:sz w:val="20"/>
-          <w:szCs w:val="20"/>
-        </w:rPr>
-        <w:t xml:space="preserve">Authored detailed mathematical and engineering documentation: per-variant FLOP </w:t>
-      </w:r>
-      <w:r>
-        <w:rPr>
-          <w:rFonts w:ascii="Calibri" w:cs="Calibri" w:eastAsia="Calibri" w:hAnsi="Calibri"/>
-          <w:sz w:val="20"/>
-          <w:szCs w:val="20"/>
-        </w:rPr>
-        <w:t xml:space="preserve">analysis, GPU tensor-core vs TRSM trade-offs, performance-improvement task list.</w:t>
+        <w:t>Designed and implemented three K-FAC second-order optimiser variants — Classic, Cholesky-based OlsSM, and QR-based Vered — sharing a common framework so the inversion strategy is the only differentiator.</w:t>
+      </w:r>
+    </w:p>
+    <w:p>
+      <w:pPr>
+        <w:spacing w:after="20" w:before="120"/>
+      </w:pPr>
+      <w:r>
+        <w:rPr>
+          <w:rFonts w:ascii="Calibri" w:cs="Calibri" w:eastAsia="Calibri" w:hAnsi="Calibri"/>
+          <w:b/>
+          <w:bCs/>
+          <w:sz w:val="20"/>
+          <w:szCs w:val="20"/>
+        </w:rPr>
+        <w:t>Numerical analysis</w:t>
+      </w:r>
+    </w:p>
+    <w:p>
+      <w:pPr>
+        <w:pStyle w:val="ListParagraph"/>
+        <w:numPr>
+          <w:ilvl w:val="0"/>
+          <w:numId w:val="2"/>
+        </w:numPr>
+        <w:spacing w:after="60"/>
+      </w:pPr>
+      <w:r>
+        <w:rPr>
+          <w:rFonts w:ascii="Calibri" w:cs="Calibri" w:eastAsia="Calibri" w:hAnsi="Calibri"/>
+          <w:sz w:val="20"/>
+          <w:szCs w:val="20"/>
+        </w:rPr>
+        <w:t>Derived and empirically validated per-variant error scaling: κ(X)⁴·ε (Classic), κ(X)²·ε (OlsSM), κ(X)¹·ε (Vered). Methods: perturbation analysis, controlled κ-vs-error studies.</w:t>
+      </w:r>
+    </w:p>
+    <w:p>
+      <w:pPr>
+        <w:spacing w:after="20" w:before="120"/>
+      </w:pPr>
+      <w:r>
+        <w:rPr>
+          <w:rFonts w:ascii="Calibri" w:cs="Calibri" w:eastAsia="Calibri" w:hAnsi="Calibri"/>
+          <w:b/>
+          <w:bCs/>
+          <w:sz w:val="20"/>
+          <w:szCs w:val="20"/>
+        </w:rPr>
+        <w:t>Implementation</w:t>
+      </w:r>
+    </w:p>
+    <w:p>
+      <w:pPr>
+        <w:pStyle w:val="ListParagraph"/>
+        <w:numPr>
+          <w:ilvl w:val="0"/>
+          <w:numId w:val="2"/>
+        </w:numPr>
+        <w:spacing w:after="60"/>
+      </w:pPr>
+      <w:r>
+        <w:rPr>
+          <w:rFonts w:ascii="Calibri" w:cs="Calibri" w:eastAsia="Calibri" w:hAnsi="Calibri"/>
+          <w:sz w:val="20"/>
+          <w:szCs w:val="20"/>
+        </w:rPr>
+        <w:t>Rust core with PyO3 bindings; faer SIMD on CPU, CUDA / cuSOLVER on GPU. Methods: partial-pivot LU, modified Cholesky, randomized EVD (Halko–Martinsson–Tropp), streaming TSQR with damping via ridge augmentation.</w:t>
+      </w:r>
+    </w:p>
+    <w:p>
+      <w:pPr>
+        <w:spacing w:after="20" w:before="120"/>
+      </w:pPr>
+      <w:r>
+        <w:rPr>
+          <w:rFonts w:ascii="Calibri" w:cs="Calibri" w:eastAsia="Calibri" w:hAnsi="Calibri"/>
+          <w:b/>
+          <w:bCs/>
+          <w:sz w:val="20"/>
+          <w:szCs w:val="20"/>
+        </w:rPr>
+        <w:t>Benchmarking &amp; experimental design</w:t>
+      </w:r>
+    </w:p>
+    <w:p>
+      <w:pPr>
+        <w:pStyle w:val="ListParagraph"/>
+        <w:numPr>
+          <w:ilvl w:val="0"/>
+          <w:numId w:val="2"/>
+        </w:numPr>
+        <w:spacing w:after="60"/>
+      </w:pPr>
+      <w:r>
+        <w:rPr>
+          <w:rFonts w:ascii="Calibri" w:cs="Calibri" w:eastAsia="Calibri" w:hAnsi="Calibri"/>
+          <w:sz w:val="20"/>
+          <w:szCs w:val="20"/>
+        </w:rPr>
+        <w:t>Built four end-to-end suites: GPU training, stability frontier, gradient-clip frontier, layer-retrainer with BCD / LoRA. Methods: 2D (mom × LR) hyperparameter screens, multi-seed runs, condition-number tracking, automatic divergence detection.</w:t>
+      </w:r>
+    </w:p>
+    <w:p>
+      <w:pPr>
+        <w:spacing w:after="20" w:before="120"/>
+      </w:pPr>
+      <w:r>
+        <w:rPr>
+          <w:rFonts w:ascii="Calibri" w:cs="Calibri" w:eastAsia="Calibri" w:hAnsi="Calibri"/>
+          <w:b/>
+          <w:bCs/>
+          <w:sz w:val="20"/>
+          <w:szCs w:val="20"/>
+        </w:rPr>
+        <w:t>Results</w:t>
+      </w:r>
+    </w:p>
+    <w:p>
+      <w:pPr>
+        <w:pStyle w:val="ListParagraph"/>
+        <w:numPr>
+          <w:ilvl w:val="0"/>
+          <w:numId w:val="2"/>
+        </w:numPr>
+        <w:spacing w:after="60"/>
+      </w:pPr>
+      <w:r>
+        <w:rPr>
+          <w:rFonts w:ascii="Calibri" w:cs="Calibri" w:eastAsia="Calibri" w:hAnsi="Calibri"/>
+          <w:sz w:val="20"/>
+          <w:szCs w:val="20"/>
+        </w:rPr>
+        <w:t>On SmallGPT pre-training (WikiText-2), Vered matches ClassicKFAC perplexity at identical hyperparameters; the predicted κ¹ advantage manifests as wider low-damping tolerance (stable at 100× lower damping than Classic), not as a convergence gain — an honest characterization of when numerical-stability gains do and do not translate to training benefit.</w:t>
+      </w:r>
+    </w:p>
+    <w:p>
+      <w:pPr>
+        <w:spacing w:after="20" w:before="120"/>
+      </w:pPr>
+      <w:r>
+        <w:rPr>
+          <w:rFonts w:ascii="Calibri" w:cs="Calibri" w:eastAsia="Calibri" w:hAnsi="Calibri"/>
+          <w:b/>
+          <w:bCs/>
+          <w:sz w:val="20"/>
+          <w:szCs w:val="20"/>
+        </w:rPr>
+        <w:t>Engineering issues diagnosed &amp; resolved</w:t>
+      </w:r>
+    </w:p>
+    <w:p>
+      <w:pPr>
+        <w:pStyle w:val="ListParagraph"/>
+        <w:numPr>
+          <w:ilvl w:val="0"/>
+          <w:numId w:val="2"/>
+        </w:numPr>
+        <w:spacing w:after="60"/>
+      </w:pPr>
+      <w:r>
+        <w:rPr>
+          <w:rFonts w:ascii="Calibri" w:cs="Calibri" w:eastAsia="Calibri" w:hAnsi="Calibri"/>
+          <w:sz w:val="20"/>
+          <w:szCs w:val="20"/>
+        </w:rPr>
+        <w:t>Streaming-TSQR p≥n violations; Cholesky failures on non-PSD Gram matrices (EVD-projection fallback); BCD oscillation in coupled layer chains (warm-start fix).</w:t>
+      </w:r>
+    </w:p>
+    <w:p>
+      <w:pPr>
+        <w:tabs>
+          <w:tab w:val="right" w:pos="9026"/>
+        </w:tabs>
+        <w:spacing w:after="40" w:before="240"/>
+      </w:pPr>
+      <w:r>
+        <w:rPr>
+          <w:rFonts w:ascii="Calibri" w:cs="Calibri" w:eastAsia="Calibri" w:hAnsi="Calibri"/>
+          <w:b/>
+          <w:bCs/>
+          <w:sz w:val="22"/>
+          <w:szCs w:val="22"/>
+        </w:rPr>
+        <w:t xml:space="preserve">Closed-Form Target Propagation: Cross-Architecture Characterization</w:t>
+      </w:r>
+      <w:r>
+        <w:rPr>
+          <w:rFonts w:ascii="Calibri" w:cs="Calibri" w:eastAsia="Calibri" w:hAnsi="Calibri"/>
+          <w:i/>
+          <w:iCs/>
+          <w:color w:val="595959"/>
+          <w:sz w:val="20"/>
+          <w:szCs w:val="20"/>
+        </w:rPr>
+        <w:t xml:space="preserve">	2025 – Present</w:t>
+      </w:r>
+    </w:p>
+    <w:p>
+      <w:pPr>
+        <w:spacing w:after="40" w:before="60"/>
+      </w:pPr>
+      <w:r>
+        <w:rPr>
+          <w:rFonts w:ascii="Calibri" w:cs="Calibri" w:eastAsia="Calibri" w:hAnsi="Calibri"/>
+          <w:i/>
+          <w:iCs/>
+          <w:color w:val="595959"/>
+          <w:sz w:val="20"/>
+          <w:szCs w:val="20"/>
+        </w:rPr>
+        <w:t xml:space="preserve">Open-source research project — Python (PyTorch)</w:t>
+      </w:r>
+    </w:p>
+    <w:p>
+      <w:pPr>
+        <w:pStyle w:val="ListParagraph"/>
+        <w:numPr>
+          <w:ilvl w:val="0"/>
+          <w:numId w:val="2"/>
+        </w:numPr>
+        <w:spacing w:after="60"/>
+      </w:pPr>
+      <w:r>
+        <w:rPr>
+          <w:rFonts w:ascii="Calibri" w:cs="Calibri" w:eastAsia="Calibri" w:hAnsi="Calibri"/>
+          <w:sz w:val="20"/>
+          <w:szCs w:val="20"/>
+        </w:rPr>
+        <w:t>Investigated closed-form per-layer least-squares as an alternative to gradient-based training: how far a deep network can be retrained without back-propagation, and where the wall is.</w:t>
+      </w:r>
+    </w:p>
+    <w:p>
+      <w:pPr>
+        <w:spacing w:after="20" w:before="120"/>
+      </w:pPr>
+      <w:r>
+        <w:rPr>
+          <w:rFonts w:ascii="Calibri" w:cs="Calibri" w:eastAsia="Calibri" w:hAnsi="Calibri"/>
+          <w:b/>
+          <w:bCs/>
+          <w:sz w:val="20"/>
+          <w:szCs w:val="20"/>
+        </w:rPr>
+        <w:t>Algorithms &amp; methods</w:t>
+      </w:r>
+    </w:p>
+    <w:p>
+      <w:pPr>
+        <w:pStyle w:val="ListParagraph"/>
+        <w:numPr>
+          <w:ilvl w:val="0"/>
+          <w:numId w:val="2"/>
+        </w:numPr>
+        <w:spacing w:after="60"/>
+      </w:pPr>
+      <w:r>
+        <w:rPr>
+          <w:rFonts w:ascii="Calibri" w:cs="Calibri" w:eastAsia="Calibri" w:hAnsi="Calibri"/>
+          <w:sz w:val="20"/>
+          <w:szCs w:val="20"/>
+        </w:rPr>
+        <w:t>Closed-form per-layer least-squares Target Propagation; Block Coordinate Descent over coupled layers; per-layer Tikhonov regularization. Variants: TP-distill, label-retrain (single pass), iterative refinement, OLS-init + SGD warm-start.</w:t>
+      </w:r>
+    </w:p>
+    <w:p>
+      <w:pPr>
+        <w:spacing w:after="20" w:before="120"/>
+      </w:pPr>
+      <w:r>
+        <w:rPr>
+          <w:rFonts w:ascii="Calibri" w:cs="Calibri" w:eastAsia="Calibri" w:hAnsi="Calibri"/>
+          <w:b/>
+          <w:bCs/>
+          <w:sz w:val="20"/>
+          <w:szCs w:val="20"/>
+        </w:rPr>
+        <w:t>Architectures evaluated</w:t>
+      </w:r>
+    </w:p>
+    <w:p>
+      <w:pPr>
+        <w:pStyle w:val="ListParagraph"/>
+        <w:numPr>
+          <w:ilvl w:val="0"/>
+          <w:numId w:val="2"/>
+        </w:numPr>
+        <w:spacing w:after="60"/>
+      </w:pPr>
+      <w:r>
+        <w:rPr>
+          <w:rFonts w:ascii="Calibri" w:cs="Calibri" w:eastAsia="Calibri" w:hAnsi="Calibri"/>
+          <w:sz w:val="20"/>
+          <w:szCs w:val="20"/>
+        </w:rPr>
+        <w:t>Deep MLP, LayerNorm-MLP, CNN (with and without max-pool), Transformer (full + attention isolation experiments).</w:t>
+      </w:r>
+    </w:p>
+    <w:p>
+      <w:pPr>
+        <w:spacing w:after="20" w:before="120"/>
+      </w:pPr>
+      <w:r>
+        <w:rPr>
+          <w:rFonts w:ascii="Calibri" w:cs="Calibri" w:eastAsia="Calibri" w:hAnsi="Calibri"/>
+          <w:b/>
+          <w:bCs/>
+          <w:sz w:val="20"/>
+          <w:szCs w:val="20"/>
+        </w:rPr>
+        <w:t>Results (3-seed averaged)</w:t>
+      </w:r>
+    </w:p>
+    <w:p>
+      <w:pPr>
+        <w:pStyle w:val="ListParagraph"/>
+        <w:numPr>
+          <w:ilvl w:val="0"/>
+          <w:numId w:val="2"/>
+        </w:numPr>
+        <w:spacing w:after="60"/>
+      </w:pPr>
+      <w:r>
+        <w:rPr>
+          <w:rFonts w:ascii="Calibri" w:cs="Calibri" w:eastAsia="Calibri" w:hAnsi="Calibri"/>
+          <w:sz w:val="20"/>
+          <w:szCs w:val="20"/>
+        </w:rPr>
+        <w:t>Single-pass TP-retrain on LayerNorm-MLP: 0.741 ± 0.002 from random init — the one solid positive across architectures.</w:t>
+      </w:r>
+    </w:p>
+    <w:p>
+      <w:pPr>
+        <w:pStyle w:val="ListParagraph"/>
+        <w:numPr>
+          <w:ilvl w:val="0"/>
+          <w:numId w:val="2"/>
+        </w:numPr>
+        <w:spacing w:after="60"/>
+      </w:pPr>
+      <w:r>
+        <w:rPr>
+          <w:rFonts w:ascii="Calibri" w:cs="Calibri" w:eastAsia="Calibri" w:hAnsi="Calibri"/>
+          <w:sz w:val="20"/>
+          <w:szCs w:val="20"/>
+        </w:rPr>
+        <w:t>Distillation high across architectures (0.96–0.97). Walls: CNN TP-retrain (≤ 0.33), Transformer TP-retrain (failed), attention V-inverse information-theoretically uncrossable even with teacher A*.</w:t>
+      </w:r>
+    </w:p>
+    <w:p>
+      <w:pPr>
+        <w:pStyle w:val="ListParagraph"/>
+        <w:numPr>
+          <w:ilvl w:val="0"/>
+          <w:numId w:val="2"/>
+        </w:numPr>
+        <w:spacing w:after="60"/>
+      </w:pPr>
+      <w:r>
+        <w:rPr>
+          <w:rFonts w:ascii="Calibri" w:cs="Calibri" w:eastAsia="Calibri" w:hAnsi="Calibri"/>
+          <w:sz w:val="20"/>
+          <w:szCs w:val="20"/>
+        </w:rPr>
+        <w:t>Warm-start: negative — OLS-label init does not beat random init on break-even FLOPs.</w:t>
       </w:r>
     </w:p>
     <w:p>
@@ -1318,29 +1463,6 @@
           <w:szCs w:val="20"/>
         </w:rPr>
         <w:t xml:space="preserve">Hebrew (native), English (fluent), Russian (limited working).</w:t>
-      </w:r>
-    </w:p>
-    <w:p>
-      <w:pPr>
-        <w:spacing w:after="60"/>
-      </w:pPr>
-      <w:r>
-        <w:rPr>
-          <w:rFonts w:ascii="Calibri" w:cs="Calibri" w:eastAsia="Calibri" w:hAnsi="Calibri"/>
-          <w:b/>
-          <w:bCs/>
-          <w:sz w:val="20"/>
-          <w:szCs w:val="20"/>
-        </w:rPr>
-        <w:t xml:space="preserve">Military service: </w:t>
-      </w:r>
-      <w:r>
-        <w:rPr>
-          <w:rFonts w:ascii="Calibri" w:cs="Calibri" w:eastAsia="Calibri" w:hAnsi="Calibri"/>
-          <w:sz w:val="20"/>
-          <w:szCs w:val="20"/>
-        </w:rPr>
-        <w:t xml:space="preserve">1993 – 1996, Golani Brigade, IDF.</w:t>
       </w:r>
     </w:p>
     <w:p>

</xml_diff>